<commit_message>
Cost-coverage form: coverage includes tip
Co-Authored-By: Claude Opus 5.5 <noreply@anthropic.com>
Claude-Session: https://claude.ai/code/session_01BpCPjtkQ5YXMdKLNokz4mv
</commit_message>
<xml_diff>
--- a/.claude/context/omonia/Vorlage_Kostenuebernahmebestaetigung_Omonia.docx
+++ b/.claude/context/omonia/Vorlage_Kostenuebernahmebestaetigung_Omonia.docx
@@ -668,7 +668,7 @@
           <w:sz w:val="22"/>
           <w:szCs w:val="22"/>
         </w:rPr>
-        <w:t xml:space="preserve">Nicht von der Kostenübernahme gedeckte Beträge sind vor Ort direkt zu begleichen.</w:t>
+        <w:t xml:space="preserve">Die Kostenübernahme gilt inklusive Trinkgeld. Nicht gedeckte Beträge sind vor Ort direkt zu begleichen.</w:t>
       </w:r>
     </w:p>
     <w:p>
@@ -831,7 +831,7 @@
       </w:tr>
       <w:tr>
         <w:trPr>
-          <w:trHeight w:val="760" w:hRule="atLeast"/>
+          <w:trHeight w:val="680" w:hRule="atLeast"/>
         </w:trPr>
         <w:tc>
           <w:tcPr>

</xml_diff>

<commit_message>
Cost-coverage form: tip as percentage field
Co-Authored-By: Claude Opus 5.5 <noreply@anthropic.com>
Claude-Session: https://claude.ai/code/session_01BpCPjtkQ5YXMdKLNokz4mv
</commit_message>
<xml_diff>
--- a/.claude/context/omonia/Vorlage_Kostenuebernahmebestaetigung_Omonia.docx
+++ b/.claude/context/omonia/Vorlage_Kostenuebernahmebestaetigung_Omonia.docx
@@ -61,7 +61,7 @@
       </w:tblGrid>
       <w:tr>
         <w:trPr>
-          <w:trHeight w:val="330" w:hRule="atLeast"/>
+          <w:trHeight w:val="300" w:hRule="atLeast"/>
         </w:trPr>
         <w:tc>
           <w:tcPr>
@@ -102,7 +102,7 @@
       </w:tr>
       <w:tr>
         <w:trPr>
-          <w:trHeight w:val="330" w:hRule="atLeast"/>
+          <w:trHeight w:val="300" w:hRule="atLeast"/>
         </w:trPr>
         <w:tc>
           <w:tcPr>
@@ -143,7 +143,7 @@
       </w:tr>
       <w:tr>
         <w:trPr>
-          <w:trHeight w:val="330" w:hRule="atLeast"/>
+          <w:trHeight w:val="300" w:hRule="atLeast"/>
         </w:trPr>
         <w:tc>
           <w:tcPr>
@@ -184,7 +184,7 @@
       </w:tr>
       <w:tr>
         <w:trPr>
-          <w:trHeight w:val="330" w:hRule="atLeast"/>
+          <w:trHeight w:val="300" w:hRule="atLeast"/>
         </w:trPr>
         <w:tc>
           <w:tcPr>
@@ -225,7 +225,7 @@
       </w:tr>
       <w:tr>
         <w:trPr>
-          <w:trHeight w:val="330" w:hRule="atLeast"/>
+          <w:trHeight w:val="300" w:hRule="atLeast"/>
         </w:trPr>
         <w:tc>
           <w:tcPr>
@@ -298,7 +298,7 @@
       </w:tblGrid>
       <w:tr>
         <w:trPr>
-          <w:trHeight w:val="330" w:hRule="atLeast"/>
+          <w:trHeight w:val="300" w:hRule="atLeast"/>
         </w:trPr>
         <w:tc>
           <w:tcPr>
@@ -339,7 +339,7 @@
       </w:tr>
       <w:tr>
         <w:trPr>
-          <w:trHeight w:val="330" w:hRule="atLeast"/>
+          <w:trHeight w:val="300" w:hRule="atLeast"/>
         </w:trPr>
         <w:tc>
           <w:tcPr>
@@ -380,7 +380,7 @@
       </w:tr>
       <w:tr>
         <w:trPr>
-          <w:trHeight w:val="330" w:hRule="atLeast"/>
+          <w:trHeight w:val="300" w:hRule="atLeast"/>
         </w:trPr>
         <w:tc>
           <w:tcPr>
@@ -421,7 +421,7 @@
       </w:tr>
       <w:tr>
         <w:trPr>
-          <w:trHeight w:val="330" w:hRule="atLeast"/>
+          <w:trHeight w:val="300" w:hRule="atLeast"/>
         </w:trPr>
         <w:tc>
           <w:tcPr>
@@ -462,7 +462,7 @@
       </w:tr>
       <w:tr>
         <w:trPr>
-          <w:trHeight w:val="330" w:hRule="atLeast"/>
+          <w:trHeight w:val="300" w:hRule="atLeast"/>
         </w:trPr>
         <w:tc>
           <w:tcPr>
@@ -503,7 +503,7 @@
       </w:tr>
       <w:tr>
         <w:trPr>
-          <w:trHeight w:val="330" w:hRule="atLeast"/>
+          <w:trHeight w:val="300" w:hRule="atLeast"/>
         </w:trPr>
         <w:tc>
           <w:tcPr>
@@ -544,7 +544,7 @@
       </w:tr>
       <w:tr>
         <w:trPr>
-          <w:trHeight w:val="330" w:hRule="atLeast"/>
+          <w:trHeight w:val="300" w:hRule="atLeast"/>
         </w:trPr>
         <w:tc>
           <w:tcPr>
@@ -585,7 +585,7 @@
       </w:tr>
       <w:tr>
         <w:trPr>
-          <w:trHeight w:val="330" w:hRule="atLeast"/>
+          <w:trHeight w:val="300" w:hRule="atLeast"/>
         </w:trPr>
         <w:tc>
           <w:tcPr>
@@ -668,7 +668,7 @@
           <w:sz w:val="22"/>
           <w:szCs w:val="22"/>
         </w:rPr>
-        <w:t xml:space="preserve">Die Kostenübernahme gilt inklusive Trinkgeld. Nicht gedeckte Beträge sind vor Ort direkt zu begleichen.</w:t>
+        <w:t xml:space="preserve">Die Kostenübernahme gilt inklusive Trinkgeld in Höhe von ______ %. Nicht gedeckte Beträge sind vor Ort direkt zu begleichen.</w:t>
       </w:r>
     </w:p>
     <w:p>
@@ -749,7 +749,7 @@
       </w:tblGrid>
       <w:tr>
         <w:trPr>
-          <w:trHeight w:val="330" w:hRule="atLeast"/>
+          <w:trHeight w:val="300" w:hRule="atLeast"/>
         </w:trPr>
         <w:tc>
           <w:tcPr>
@@ -790,7 +790,7 @@
       </w:tr>
       <w:tr>
         <w:trPr>
-          <w:trHeight w:val="330" w:hRule="atLeast"/>
+          <w:trHeight w:val="300" w:hRule="atLeast"/>
         </w:trPr>
         <w:tc>
           <w:tcPr>
@@ -831,7 +831,7 @@
       </w:tr>
       <w:tr>
         <w:trPr>
-          <w:trHeight w:val="680" w:hRule="atLeast"/>
+          <w:trHeight w:val="620" w:hRule="atLeast"/>
         </w:trPr>
         <w:tc>
           <w:tcPr>
@@ -851,7 +851,7 @@
                 <w:sz w:val="22"/>
                 <w:szCs w:val="22"/>
               </w:rPr>
-              <w:t xml:space="preserve">Unterschrift und Firmenstempel</w:t>
+              <w:t xml:space="preserve">Unterschrift und Stempel</w:t>
             </w:r>
           </w:p>
         </w:tc>

</xml_diff>